<commit_message>
Polished the Word report (natural page flow, tighter code blocks) and fixed a section cross-reference
</commit_message>
<xml_diff>
--- a/DSA521S_Group11_GITHUB_SETUP.docx
+++ b/DSA521S_Group11_GITHUB_SETUP.docx
@@ -67,6 +67,9 @@
     <w:p>
       <w:pPr>
         <w:keepNext/>
+        <w:pBdr>
+          <w:bottom w:val="single" w:sz="12" w:color="01696F"/>
+        </w:pBdr>
         <w:spacing w:before="320" w:after="40"/>
       </w:pPr>
       <w:r>
@@ -83,9 +86,6 @@
       <w:pPr>
         <w:keepNext/>
         <w:spacing w:before="0" w:after="160"/>
-        <w:pBdr>
-          <w:bottom w:val="single" w:sz="12" w:color="01696F"/>
-        </w:pBdr>
       </w:pPr>
     </w:p>
     <w:p>
@@ -226,6 +226,9 @@
     <w:p>
       <w:pPr>
         <w:keepNext/>
+        <w:pBdr>
+          <w:bottom w:val="single" w:sz="12" w:color="01696F"/>
+        </w:pBdr>
         <w:spacing w:before="320" w:after="40"/>
       </w:pPr>
       <w:r>
@@ -242,9 +245,6 @@
       <w:pPr>
         <w:keepNext/>
         <w:spacing w:before="0" w:after="160"/>
-        <w:pBdr>
-          <w:bottom w:val="single" w:sz="12" w:color="01696F"/>
-        </w:pBdr>
       </w:pPr>
     </w:p>
     <w:p>
@@ -406,6 +406,9 @@
     <w:p>
       <w:pPr>
         <w:keepNext/>
+        <w:pBdr>
+          <w:bottom w:val="single" w:sz="12" w:color="01696F"/>
+        </w:pBdr>
         <w:spacing w:before="320" w:after="40"/>
       </w:pPr>
       <w:r>
@@ -422,9 +425,6 @@
       <w:pPr>
         <w:keepNext/>
         <w:spacing w:before="0" w:after="160"/>
-        <w:pBdr>
-          <w:bottom w:val="single" w:sz="12" w:color="01696F"/>
-        </w:pBdr>
       </w:pPr>
     </w:p>
     <w:p>
@@ -460,7 +460,6 @@
       <w:tblPr>
         <w:tblW w:type="auto" w:w="0"/>
         <w:jc w:val="left"/>
-        <w:tblLook w:firstColumn="1" w:firstRow="1" w:lastColumn="0" w:lastRow="0" w:noHBand="0" w:noVBand="1" w:val="04A0"/>
         <w:tblBorders>
           <w:top w:val="single" w:sz="4" w:color="D4D1CA"/>
           <w:left w:val="single" w:sz="4" w:color="D4D1CA"/>
@@ -469,6 +468,7 @@
           <w:insideH w:val="single" w:sz="4" w:color="D4D1CA"/>
           <w:insideV w:val="single" w:sz="4" w:color="D4D1CA"/>
         </w:tblBorders>
+        <w:tblLook w:firstColumn="1" w:firstRow="1" w:lastColumn="0" w:lastRow="0" w:noHBand="0" w:noVBand="1" w:val="04A0"/>
       </w:tblPr>
       <w:tblGrid>
         <w:gridCol w:w="9638"/>
@@ -599,8 +599,6 @@
       <w:tblPr>
         <w:tblW w:type="auto" w:w="0"/>
         <w:jc w:val="left"/>
-        <w:tblLayout w:type="fixed"/>
-        <w:tblLook w:firstColumn="1" w:firstRow="1" w:lastColumn="0" w:lastRow="0" w:noHBand="0" w:noVBand="1" w:val="04A0"/>
         <w:tblBorders>
           <w:top w:val="single" w:sz="4" w:color="D4D1CA"/>
           <w:left w:val="single" w:sz="4" w:color="D4D1CA"/>
@@ -609,6 +607,8 @@
           <w:insideH w:val="single" w:sz="4" w:color="D4D1CA"/>
           <w:insideV w:val="single" w:sz="4" w:color="D4D1CA"/>
         </w:tblBorders>
+        <w:tblLayout w:type="fixed"/>
+        <w:tblLook w:firstColumn="1" w:firstRow="1" w:lastColumn="0" w:lastRow="0" w:noHBand="0" w:noVBand="1" w:val="04A0"/>
       </w:tblPr>
       <w:tblGrid>
         <w:gridCol w:w="3213"/>
@@ -1010,7 +1010,6 @@
       <w:tblPr>
         <w:tblW w:type="auto" w:w="0"/>
         <w:jc w:val="left"/>
-        <w:tblLook w:firstColumn="1" w:firstRow="1" w:lastColumn="0" w:lastRow="0" w:noHBand="0" w:noVBand="1" w:val="04A0"/>
         <w:tblBorders>
           <w:top w:val="single" w:sz="4" w:color="D4D1CA"/>
           <w:left w:val="single" w:sz="4" w:color="D4D1CA"/>
@@ -1019,6 +1018,7 @@
           <w:insideH w:val="single" w:sz="4" w:color="D4D1CA"/>
           <w:insideV w:val="single" w:sz="4" w:color="D4D1CA"/>
         </w:tblBorders>
+        <w:tblLook w:firstColumn="1" w:firstRow="1" w:lastColumn="0" w:lastRow="0" w:noHBand="0" w:noVBand="1" w:val="04A0"/>
       </w:tblPr>
       <w:tblGrid>
         <w:gridCol w:w="9638"/>
@@ -1125,6 +1125,9 @@
     <w:p>
       <w:pPr>
         <w:keepNext/>
+        <w:pBdr>
+          <w:bottom w:val="single" w:sz="12" w:color="01696F"/>
+        </w:pBdr>
         <w:spacing w:before="320" w:after="40"/>
       </w:pPr>
       <w:r>
@@ -1141,9 +1144,6 @@
       <w:pPr>
         <w:keepNext/>
         <w:spacing w:before="0" w:after="160"/>
-        <w:pBdr>
-          <w:bottom w:val="single" w:sz="12" w:color="01696F"/>
-        </w:pBdr>
       </w:pPr>
     </w:p>
     <w:p>
@@ -1178,6 +1178,9 @@
     <w:p>
       <w:pPr>
         <w:keepNext/>
+        <w:pBdr>
+          <w:bottom w:val="single" w:sz="12" w:color="01696F"/>
+        </w:pBdr>
         <w:spacing w:before="320" w:after="40"/>
       </w:pPr>
       <w:r>
@@ -1194,9 +1197,6 @@
       <w:pPr>
         <w:keepNext/>
         <w:spacing w:before="0" w:after="160"/>
-        <w:pBdr>
-          <w:bottom w:val="single" w:sz="12" w:color="01696F"/>
-        </w:pBdr>
       </w:pPr>
     </w:p>
     <w:p>
@@ -1214,7 +1214,6 @@
       <w:tblPr>
         <w:tblW w:type="auto" w:w="0"/>
         <w:jc w:val="left"/>
-        <w:tblLook w:firstColumn="1" w:firstRow="1" w:lastColumn="0" w:lastRow="0" w:noHBand="0" w:noVBand="1" w:val="04A0"/>
         <w:tblBorders>
           <w:top w:val="single" w:sz="4" w:color="D4D1CA"/>
           <w:left w:val="single" w:sz="4" w:color="D4D1CA"/>
@@ -1223,6 +1222,7 @@
           <w:insideH w:val="single" w:sz="4" w:color="D4D1CA"/>
           <w:insideV w:val="single" w:sz="4" w:color="D4D1CA"/>
         </w:tblBorders>
+        <w:tblLook w:firstColumn="1" w:firstRow="1" w:lastColumn="0" w:lastRow="0" w:noHBand="0" w:noVBand="1" w:val="04A0"/>
       </w:tblPr>
       <w:tblGrid>
         <w:gridCol w:w="9638"/>

</xml_diff>